<commit_message>
Update ENSF 400 Main Project.docx
</commit_message>
<xml_diff>
--- a/Project Documentation/ENSF 400 Main Project.docx
+++ b/Project Documentation/ENSF 400 Main Project.docx
@@ -42,7 +42,7 @@
           <w:pgNumType w:start="1"/>
         </w:sectPr>
       </w:pPr>
-      <w:bookmarkStart w:colFirst="0" w:colLast="0" w:name="_t3cs2bwy7fup" w:id="0"/>
+      <w:bookmarkStart w:colFirst="0" w:colLast="0" w:name="_56eethntl5sa" w:id="0"/>
       <w:bookmarkEnd w:id="0"/>
       <w:r>
         <w:rPr>
@@ -2816,7 +2816,7 @@
           <w:pgNumType w:start="1"/>
         </w:sectPr>
       </w:pPr>
-      <w:bookmarkStart w:colFirst="0" w:colLast="0" w:name="_aymnkeh9hjnd" w:id="11"/>
+      <w:bookmarkStart w:colFirst="0" w:colLast="0" w:name="_1lyiwchbcblv" w:id="11"/>
       <w:bookmarkEnd w:id="11"/>
       <w:r>
         <w:rPr>
@@ -5104,7 +5104,7 @@
           <w:pgNumType w:start="1"/>
         </w:sectPr>
       </w:pPr>
-      <w:bookmarkStart w:colFirst="0" w:colLast="0" w:name="_ol4osbi4kfu2" w:id="18"/>
+      <w:bookmarkStart w:colFirst="0" w:colLast="0" w:name="_nflnx1ytrv0x" w:id="18"/>
       <w:bookmarkEnd w:id="18"/>
       <w:r>
         <w:rPr>
@@ -5175,7 +5175,7 @@
         <w:rPr>
           <w:rtl w:val="0"/>
         </w:rPr>
-        <w:t xml:space="preserve">&lt;characterName&gt;_&lt;characterID&gt;.json</w:t>
+        <w:t xml:space="preserve">&lt;characterName&gt;_&lt;storyID&gt;.json</w:t>
       </w:r>
     </w:p>
     <w:p>
@@ -5250,16 +5250,6 @@
         <w:rPr>
           <w:rtl w:val="0"/>
         </w:rPr>
-      </w:r>
-    </w:p>
-    <w:p>
-      <w:pPr>
-        <w:rPr/>
-      </w:pPr>
-      <w:r>
-        <w:rPr>
-          <w:rtl w:val="0"/>
-        </w:rPr>
         <w:t xml:space="preserve">[</w:t>
       </w:r>
     </w:p>
@@ -5271,29 +5261,8 @@
         <w:rPr>
           <w:rtl w:val="0"/>
         </w:rPr>
-        <w:t xml:space="preserve">ID: 0</w:t>
-      </w:r>
-    </w:p>
-    <w:p>
-      <w:pPr>
-        <w:rPr/>
-      </w:pPr>
-      <w:r>
-        <w:rPr>
-          <w:rtl w:val="0"/>
-        </w:rPr>
-        <w:t xml:space="preserve">Human: 1</w:t>
-      </w:r>
-    </w:p>
-    <w:p>
-      <w:pPr>
-        <w:rPr/>
-      </w:pPr>
-      <w:r>
-        <w:rPr>
-          <w:rtl w:val="0"/>
-        </w:rPr>
-        <w:t xml:space="preserve">Script:</w:t>
+        <w:tab/>
+        <w:t xml:space="preserve">// this first part will be for metadata?</w:t>
       </w:r>
     </w:p>
     <w:p>
@@ -5317,11 +5286,75 @@
           <w:rtl w:val="0"/>
         </w:rPr>
         <w:tab/>
+        <w:t xml:space="preserve">ID: 1</w:t>
+      </w:r>
+    </w:p>
+    <w:p>
+      <w:pPr>
+        <w:ind w:left="720" w:firstLine="0"/>
+        <w:rPr/>
+      </w:pPr>
+      <w:r>
+        <w:rPr>
+          <w:rtl w:val="0"/>
+        </w:rPr>
+        <w:t xml:space="preserve">Human: 1 // if human, 1, if not human, 0</w:t>
+      </w:r>
+    </w:p>
+    <w:p>
+      <w:pPr>
+        <w:ind w:left="720" w:firstLine="0"/>
+        <w:rPr/>
+      </w:pPr>
+      <w:r>
+        <w:rPr>
+          <w:rtl w:val="0"/>
+        </w:rPr>
+        <w:t xml:space="preserve">Script:</w:t>
+      </w:r>
+    </w:p>
+    <w:p>
+      <w:pPr>
+        <w:ind w:left="720" w:firstLine="0"/>
+        <w:rPr/>
+      </w:pPr>
+      <w:r>
+        <w:rPr>
+          <w:rtl w:val="0"/>
+        </w:rPr>
+        <w:tab/>
+        <w:t xml:space="preserve">// the script starts here</w:t>
+      </w:r>
+    </w:p>
+    <w:p>
+      <w:pPr>
+        <w:ind w:left="720" w:firstLine="0"/>
+        <w:rPr/>
+      </w:pPr>
+      <w:r>
+        <w:rPr>
+          <w:rtl w:val="0"/>
+        </w:rPr>
+        <w:tab/>
+        <w:t xml:space="preserve">{</w:t>
+      </w:r>
+    </w:p>
+    <w:p>
+      <w:pPr>
+        <w:ind w:left="720" w:firstLine="0"/>
+        <w:rPr/>
+      </w:pPr>
+      <w:r>
+        <w:rPr>
+          <w:rtl w:val="0"/>
+        </w:rPr>
+        <w:tab/>
         <w:t xml:space="preserve">Phase: 0</w:t>
       </w:r>
     </w:p>
     <w:p>
       <w:pPr>
+        <w:ind w:left="720" w:firstLine="0"/>
         <w:rPr/>
       </w:pPr>
       <w:r>
@@ -5334,7 +5367,7 @@
     </w:p>
     <w:p>
       <w:pPr>
-        <w:ind w:left="720" w:firstLine="720"/>
+        <w:ind w:left="1440" w:firstLine="720"/>
         <w:rPr/>
       </w:pPr>
       <w:r>
@@ -5346,7 +5379,7 @@
     </w:p>
     <w:p>
       <w:pPr>
-        <w:ind w:left="720" w:firstLine="720"/>
+        <w:ind w:left="1440" w:firstLine="720"/>
         <w:rPr/>
       </w:pPr>
       <w:r>
@@ -5358,7 +5391,7 @@
     </w:p>
     <w:p>
       <w:pPr>
-        <w:ind w:left="720" w:firstLine="720"/>
+        <w:ind w:left="1440" w:firstLine="720"/>
         <w:rPr/>
       </w:pPr>
       <w:r>
@@ -5370,7 +5403,7 @@
     </w:p>
     <w:p>
       <w:pPr>
-        <w:ind w:left="720" w:firstLine="720"/>
+        <w:ind w:left="1440" w:firstLine="720"/>
         <w:rPr/>
       </w:pPr>
       <w:r>
@@ -5382,7 +5415,7 @@
     </w:p>
     <w:p>
       <w:pPr>
-        <w:ind w:left="720" w:firstLine="720"/>
+        <w:ind w:left="1440" w:firstLine="720"/>
         <w:rPr/>
       </w:pPr>
       <w:r>
@@ -5394,7 +5427,7 @@
     </w:p>
     <w:p>
       <w:pPr>
-        <w:ind w:left="720" w:firstLine="720"/>
+        <w:ind w:left="1440" w:firstLine="720"/>
         <w:rPr/>
       </w:pPr>
       <w:r>
@@ -5406,7 +5439,7 @@
     </w:p>
     <w:p>
       <w:pPr>
-        <w:ind w:left="720" w:firstLine="720"/>
+        <w:ind w:left="1440" w:firstLine="720"/>
         <w:rPr/>
       </w:pPr>
       <w:r>
@@ -5418,7 +5451,7 @@
     </w:p>
     <w:p>
       <w:pPr>
-        <w:ind w:left="720" w:firstLine="720"/>
+        <w:ind w:left="1440" w:firstLine="720"/>
         <w:rPr/>
       </w:pPr>
       <w:r>
@@ -5430,7 +5463,7 @@
     </w:p>
     <w:p>
       <w:pPr>
-        <w:ind w:left="720" w:firstLine="720"/>
+        <w:ind w:left="1440" w:firstLine="720"/>
         <w:rPr/>
       </w:pPr>
       <w:r>
@@ -5442,7 +5475,7 @@
     </w:p>
     <w:p>
       <w:pPr>
-        <w:ind w:left="720" w:firstLine="720"/>
+        <w:ind w:left="1440" w:firstLine="720"/>
         <w:rPr/>
       </w:pPr>
       <w:r>
@@ -5454,7 +5487,7 @@
     </w:p>
     <w:p>
       <w:pPr>
-        <w:ind w:left="720" w:firstLine="720"/>
+        <w:ind w:left="1440" w:firstLine="720"/>
         <w:rPr/>
       </w:pPr>
       <w:r>
@@ -5466,7 +5499,7 @@
     </w:p>
     <w:p>
       <w:pPr>
-        <w:ind w:left="720" w:firstLine="720"/>
+        <w:ind w:left="1440" w:firstLine="720"/>
         <w:rPr/>
       </w:pPr>
       <w:r>
@@ -5478,7 +5511,7 @@
     </w:p>
     <w:p>
       <w:pPr>
-        <w:ind w:left="720" w:firstLine="720"/>
+        <w:ind w:left="1440" w:firstLine="720"/>
         <w:rPr/>
       </w:pPr>
       <w:r>
@@ -5490,7 +5523,7 @@
     </w:p>
     <w:p>
       <w:pPr>
-        <w:ind w:left="720" w:firstLine="720"/>
+        <w:ind w:left="1440" w:firstLine="720"/>
         <w:rPr/>
       </w:pPr>
       <w:r>
@@ -5502,7 +5535,7 @@
     </w:p>
     <w:p>
       <w:pPr>
-        <w:ind w:left="720" w:firstLine="720"/>
+        <w:ind w:left="1440" w:firstLine="720"/>
         <w:rPr/>
       </w:pPr>
       <w:r>
@@ -5514,7 +5547,7 @@
     </w:p>
     <w:p>
       <w:pPr>
-        <w:ind w:left="720" w:firstLine="720"/>
+        <w:ind w:left="1440" w:firstLine="720"/>
         <w:rPr/>
       </w:pPr>
       <w:r>
@@ -5526,6 +5559,7 @@
     </w:p>
     <w:p>
       <w:pPr>
+        <w:ind w:left="720" w:firstLine="0"/>
         <w:rPr/>
       </w:pPr>
       <w:r>
@@ -5538,6 +5572,18 @@
     </w:p>
     <w:p>
       <w:pPr>
+        <w:ind w:left="720" w:firstLine="0"/>
+        <w:rPr/>
+      </w:pPr>
+      <w:r>
+        <w:rPr>
+          <w:rtl w:val="0"/>
+        </w:rPr>
+        <w:t xml:space="preserve">}</w:t>
+      </w:r>
+    </w:p>
+    <w:p>
+      <w:pPr>
         <w:rPr/>
       </w:pPr>
       <w:r>
@@ -5545,6 +5591,226 @@
           <w:rtl w:val="0"/>
         </w:rPr>
         <w:t xml:space="preserve">]</w:t>
+      </w:r>
+    </w:p>
+    <w:p>
+      <w:pPr>
+        <w:rPr/>
+      </w:pPr>
+      <w:r>
+        <w:rPr>
+          <w:rtl w:val="0"/>
+        </w:rPr>
+      </w:r>
+    </w:p>
+    <w:p>
+      <w:pPr>
+        <w:rPr>
+          <w:highlight w:val="yellow"/>
+        </w:rPr>
+      </w:pPr>
+      <w:r>
+        <w:rPr>
+          <w:highlight w:val="yellow"/>
+          <w:rtl w:val="0"/>
+        </w:rPr>
+        <w:t xml:space="preserve">hrm.. nvm please refer to docs below</w:t>
+      </w:r>
+    </w:p>
+    <w:p>
+      <w:pPr>
+        <w:rPr/>
+      </w:pPr>
+      <w:r>
+        <w:br w:type="page"/>
+      </w:r>
+      <w:r>
+        <w:rPr>
+          <w:rtl w:val="0"/>
+        </w:rPr>
+      </w:r>
+    </w:p>
+    <w:p>
+      <w:pPr>
+        <w:rPr/>
+      </w:pPr>
+      <w:r>
+        <w:rPr>
+          <w:rtl w:val="0"/>
+        </w:rPr>
+        <w:t xml:space="preserve">Each JSON file corresponds to a section of the story.</w:t>
+      </w:r>
+    </w:p>
+    <w:p>
+      <w:pPr>
+        <w:rPr/>
+      </w:pPr>
+      <w:r>
+        <w:rPr>
+          <w:rtl w:val="0"/>
+        </w:rPr>
+      </w:r>
+    </w:p>
+    <w:p>
+      <w:pPr>
+        <w:rPr/>
+      </w:pPr>
+      <w:r>
+        <w:rPr>
+          <w:rtl w:val="0"/>
+        </w:rPr>
+        <w:t xml:space="preserve">For parts of the story that do not change, they will have their own JSONs. A story ID is included in case we want to create different storylines for each phase in the future</w:t>
+      </w:r>
+    </w:p>
+    <w:p>
+      <w:pPr>
+        <w:rPr/>
+      </w:pPr>
+      <w:r>
+        <w:rPr>
+          <w:rtl w:val="0"/>
+        </w:rPr>
+        <w:tab/>
+        <w:t xml:space="preserve">&lt;storyPhaseName&gt;_&lt;storyID&gt;.json</w:t>
+      </w:r>
+    </w:p>
+    <w:p>
+      <w:pPr>
+        <w:rPr/>
+      </w:pPr>
+      <w:r>
+        <w:rPr>
+          <w:rtl w:val="0"/>
+        </w:rPr>
+      </w:r>
+    </w:p>
+    <w:p>
+      <w:pPr>
+        <w:rPr/>
+      </w:pPr>
+      <w:r>
+        <w:rPr>
+          <w:rtl w:val="0"/>
+        </w:rPr>
+        <w:t xml:space="preserve">The parts of the story that do change, and will frequently be switched out with different versions are the character interrogation phases.</w:t>
+      </w:r>
+    </w:p>
+    <w:p>
+      <w:pPr>
+        <w:rPr/>
+      </w:pPr>
+      <w:r>
+        <w:rPr>
+          <w:rtl w:val="0"/>
+        </w:rPr>
+      </w:r>
+    </w:p>
+    <w:p>
+      <w:pPr>
+        <w:rPr/>
+      </w:pPr>
+      <w:r>
+        <w:rPr>
+          <w:rtl w:val="0"/>
+        </w:rPr>
+        <w:t xml:space="preserve">These JSONs will include a story ID for different versions of human-written scripts for that character, for future replayability.</w:t>
+      </w:r>
+    </w:p>
+    <w:p>
+      <w:pPr>
+        <w:rPr/>
+      </w:pPr>
+      <w:r>
+        <w:rPr>
+          <w:rtl w:val="0"/>
+        </w:rPr>
+        <w:tab/>
+        <w:t xml:space="preserve">&lt;characterName&gt;_&lt;storyID&gt;.json</w:t>
+      </w:r>
+    </w:p>
+    <w:p>
+      <w:pPr>
+        <w:rPr/>
+      </w:pPr>
+      <w:r>
+        <w:rPr>
+          <w:rtl w:val="0"/>
+        </w:rPr>
+      </w:r>
+    </w:p>
+    <w:p>
+      <w:pPr>
+        <w:rPr/>
+      </w:pPr>
+      <w:r>
+        <w:rPr>
+          <w:rtl w:val="0"/>
+        </w:rPr>
+        <w:t xml:space="preserve">The [Turned] version of the character will have “turned” after the character name, and another story ID to differentiate between different LLM-generated versions of the script for that character.</w:t>
+      </w:r>
+    </w:p>
+    <w:p>
+      <w:pPr>
+        <w:ind w:firstLine="720"/>
+        <w:rPr/>
+      </w:pPr>
+      <w:r>
+        <w:rPr>
+          <w:rtl w:val="0"/>
+        </w:rPr>
+        <w:t xml:space="preserve">&lt;characterName&gt;_turned_&lt;storyID&gt;.json</w:t>
+      </w:r>
+    </w:p>
+    <w:p>
+      <w:pPr>
+        <w:rPr/>
+      </w:pPr>
+      <w:r>
+        <w:rPr>
+          <w:rtl w:val="0"/>
+        </w:rPr>
+      </w:r>
+    </w:p>
+    <w:p>
+      <w:pPr>
+        <w:rPr/>
+      </w:pPr>
+      <w:r>
+        <w:rPr>
+          <w:rtl w:val="0"/>
+        </w:rPr>
+        <w:t xml:space="preserve">NOTE: The ID 0 for these JSONs is reserved for our game’s pre-set LLM-generated scripts, for our energy-saving feature.</w:t>
+      </w:r>
+    </w:p>
+    <w:p>
+      <w:pPr>
+        <w:rPr/>
+      </w:pPr>
+      <w:r>
+        <w:rPr>
+          <w:rtl w:val="0"/>
+        </w:rPr>
+      </w:r>
+    </w:p>
+    <w:p>
+      <w:pPr>
+        <w:rPr/>
+      </w:pPr>
+      <w:r>
+        <w:rPr>
+          <w:rtl w:val="0"/>
+        </w:rPr>
+      </w:r>
+    </w:p>
+    <w:p>
+      <w:pPr>
+        <w:rPr/>
+      </w:pPr>
+      <w:r>
+        <w:rPr>
+          <w:rtl w:val="0"/>
+        </w:rPr>
+        <w:t xml:space="preserve">Holy guacamole using JSON for dialogue lines is inefficient, especially when its only functionality is used for parsing through each line. Maybe it can help with using DAGs for more dialogue options in the future, but the data structure used to store our script definitely needs to be thought about some more.</w:t>
       </w:r>
     </w:p>
     <w:p>
@@ -5614,18 +5880,18 @@
         <w:rPr>
           <w:rtl w:val="0"/>
         </w:rPr>
-        <w:t xml:space="preserve">0: Narrator? / MC</w:t>
-      </w:r>
-    </w:p>
-    <w:p>
-      <w:pPr>
-        <w:rPr/>
-      </w:pPr>
-      <w:r>
-        <w:rPr>
-          <w:rtl w:val="0"/>
-        </w:rPr>
-        <w:t xml:space="preserve">1: John-Jean Kaisen</w:t>
+        <w:t xml:space="preserve">0: Narrator/MC</w:t>
+      </w:r>
+    </w:p>
+    <w:p>
+      <w:pPr>
+        <w:rPr/>
+      </w:pPr>
+      <w:r>
+        <w:rPr>
+          <w:rtl w:val="0"/>
+        </w:rPr>
+        <w:t xml:space="preserve">1: Nico</w:t>
       </w:r>
     </w:p>
     <w:p>
@@ -5713,92 +5979,29 @@
         <w:rPr>
           <w:rtl w:val="0"/>
         </w:rPr>
-        <w:t xml:space="preserve">1: Day 1</w:t>
-      </w:r>
-    </w:p>
-    <w:p>
-      <w:pPr>
-        <w:rPr/>
-      </w:pPr>
-      <w:r>
-        <w:rPr>
-          <w:rtl w:val="0"/>
-        </w:rPr>
-        <w:t xml:space="preserve">2: Day 2</w:t>
-      </w:r>
-    </w:p>
-    <w:p>
-      <w:pPr>
-        <w:rPr/>
-      </w:pPr>
-      <w:r>
-        <w:rPr>
-          <w:rtl w:val="0"/>
-        </w:rPr>
-        <w:t xml:space="preserve">3: Day 3</w:t>
-      </w:r>
-    </w:p>
-    <w:p>
-      <w:pPr>
-        <w:rPr/>
-      </w:pPr>
-      <w:r>
-        <w:rPr>
-          <w:rtl w:val="0"/>
-        </w:rPr>
-      </w:r>
-    </w:p>
-    <w:p>
-      <w:pPr>
-        <w:rPr/>
-      </w:pPr>
-      <w:r>
-        <w:rPr>
-          <w:rtl w:val="0"/>
-        </w:rPr>
-      </w:r>
-    </w:p>
-    <w:p>
-      <w:pPr>
-        <w:pStyle w:val="Heading1"/>
-        <w:rPr/>
-      </w:pPr>
-      <w:bookmarkStart w:colFirst="0" w:colLast="0" w:name="_9j5qmkwsh96k" w:id="24"/>
-      <w:bookmarkEnd w:id="24"/>
-      <w:r>
-        <w:rPr>
-          <w:rtl w:val="0"/>
-        </w:rPr>
-        <w:t xml:space="preserve">DAY 1 CHARACTER SCRIPTS:</w:t>
-      </w:r>
-    </w:p>
-    <w:p>
-      <w:pPr>
-        <w:rPr/>
-      </w:pPr>
-      <w:r>
-        <w:rPr>
-          <w:b w:val="1"/>
-          <w:bCs w:val="1"/>
-          <w:rtl w:val="0"/>
-        </w:rPr>
-        <w:t xml:space="preserve">CHARACTER:</w:t>
-      </w:r>
-      <w:r>
-        <w:rPr>
-          <w:rtl w:val="0"/>
-        </w:rPr>
-        <w:t xml:space="preserve"> JOHN-JEAN KAISEN</w:t>
-      </w:r>
-    </w:p>
-    <w:p>
-      <w:pPr>
-        <w:rPr/>
-      </w:pPr>
-      <w:r>
-        <w:rPr>
-          <w:rtl w:val="0"/>
-        </w:rPr>
+        <w:t xml:space="preserve">1: Act 1</w:t>
+      </w:r>
+    </w:p>
+    <w:p>
+      <w:pPr>
+        <w:rPr/>
+      </w:pPr>
+      <w:r>
+        <w:rPr>
+          <w:rtl w:val="0"/>
+        </w:rPr>
+        <w:t xml:space="preserve">2: Act 2</w:t>
+      </w:r>
+    </w:p>
+    <w:p>
+      <w:pPr>
+        <w:rPr/>
+      </w:pPr>
+      <w:r>
+        <w:rPr>
+          <w:rtl w:val="0"/>
+        </w:rPr>
+        <w:t xml:space="preserve">3: Act 3</w:t>
       </w:r>
     </w:p>
     <w:p>
@@ -5816,7 +6019,6 @@
         <w:rPr>
           <w:rtl w:val="0"/>
         </w:rPr>
-        <w:t xml:space="preserve">JJK: </w:t>
       </w:r>
     </w:p>
     <w:p>
@@ -5846,8 +6048,8 @@
           <w:pgNumType w:start="1"/>
         </w:sectPr>
       </w:pPr>
-      <w:bookmarkStart w:colFirst="0" w:colLast="0" w:name="_gz722h3e8im6" w:id="25"/>
-      <w:bookmarkEnd w:id="25"/>
+      <w:bookmarkStart w:colFirst="0" w:colLast="0" w:name="_j35xd1eu2m38" w:id="24"/>
+      <w:bookmarkEnd w:id="24"/>
       <w:r>
         <w:rPr>
           <w:rFonts w:ascii="Times New Roman" w:cs="Times New Roman" w:eastAsia="Times New Roman" w:hAnsi="Times New Roman"/>

</xml_diff>